<commit_message>
docs: export Word v0.0.105 (memoria v4.1, calibracion tarifas)
Co-authored-by: Cursor <cursoragent@cursor.com>
</commit_message>
<xml_diff>
--- a/docs/Modelo-Negocio-Uber-Truck.docx
+++ b/docs/Modelo-Negocio-Uber-Truck.docx
@@ -51,14 +51,14 @@
       </w:r>
       <w:r>
         <w:rPr/>
-        <w:t xml:space="preserve"> 2.1 · mayo 2026 · Complementa </w:t>
+        <w:t xml:space="preserve"> 2.3 · 25 may 2026 · Complementa </w:t>
       </w:r>
       <w:hyperlink r:id="rId6">
         <w:r>
           <w:rPr>
             <w:rStyle w:val="Hyperlink"/>
           </w:rPr>
-          <w:t xml:space="preserve">memoria técnica</w:t>
+          <w:t xml:space="preserve">memoria técnica v4.1</w:t>
         </w:r>
       </w:hyperlink>
     </w:p>
@@ -668,7 +668,333 @@
       </w:pPr>
       <w:r>
         <w:rPr/>
-        <w:t xml:space="preserve">Fase A — Take rate (MVP)</w:t>
+        <w:t xml:space="preserve">Fase A — Take rate dual (MVP — diseño cerrado may 2026)</w:t>
+      </w:r>
+    </w:p>
+    <w:tbl>
+      <w:tblPr>
+        <w:tblBorders>
+          <w:top w:val="single" w:sz="2" w:space="0" w:color="000000"/>
+          <w:bottom w:val="single" w:sz="2" w:space="0" w:color="000000"/>
+          <w:left w:val="single" w:sz="2" w:space="0" w:color="000000"/>
+          <w:right w:val="single" w:sz="2" w:space="0" w:color="000000"/>
+        </w:tblBorders>
+        <w:tblCellSpacing w:w="0" w:type="dxa"/>
+        <w:tblCellMar>
+          <w:top w:type="dxa" w:w="80"/>
+          <w:bottom w:type="dxa" w:w="80"/>
+          <w:left w:type="dxa" w:w="160"/>
+          <w:right w:type="dxa" w:w="160"/>
+        </w:tblCellMar>
+        <w:jc w:val="center"/>
+      </w:tblPr>
+      <w:tblGrid>
+        <w:gridCol w:w="2880"/>
+        <w:gridCol w:w="2880"/>
+        <w:gridCol w:w="2880"/>
+      </w:tblGrid>
+      <w:tr>
+        <w:trPr/>
+        <w:tc>
+          <w:tcPr>
+            <w:tcBorders>
+              <w:top w:val="single" w:sz="1" w:space="0" w:color="000000"/>
+              <w:bottom w:val="single" w:sz="1" w:space="0" w:color="000000"/>
+              <w:left w:val="single" w:sz="1" w:space="0" w:color="000000"/>
+              <w:right w:val="single" w:sz="1" w:space="0" w:color="000000"/>
+            </w:tcBorders>
+          </w:tcPr>
+          <w:p>
+            <w:pPr>
+              <w:spacing w:lineRule="auto"/>
+            </w:pPr>
+            <w:r>
+              <w:rPr/>
+              <w:t xml:space="preserve">Rol</w:t>
+            </w:r>
+          </w:p>
+        </w:tc>
+        <w:tc>
+          <w:tcPr>
+            <w:tcBorders>
+              <w:top w:val="single" w:sz="1" w:space="0" w:color="000000"/>
+              <w:bottom w:val="single" w:sz="1" w:space="0" w:color="000000"/>
+              <w:left w:val="single" w:sz="1" w:space="0" w:color="000000"/>
+              <w:right w:val="single" w:sz="1" w:space="0" w:color="000000"/>
+            </w:tcBorders>
+          </w:tcPr>
+          <w:p>
+            <w:pPr>
+              <w:spacing w:lineRule="auto"/>
+            </w:pPr>
+            <w:r>
+              <w:rPr/>
+              <w:t xml:space="preserve">Comisión</w:t>
+            </w:r>
+          </w:p>
+        </w:tc>
+        <w:tc>
+          <w:tcPr>
+            <w:tcBorders>
+              <w:top w:val="single" w:sz="1" w:space="0" w:color="000000"/>
+              <w:bottom w:val="single" w:sz="1" w:space="0" w:color="000000"/>
+              <w:left w:val="single" w:sz="1" w:space="0" w:color="000000"/>
+              <w:right w:val="single" w:sz="1" w:space="0" w:color="000000"/>
+            </w:tcBorders>
+          </w:tcPr>
+          <w:p>
+            <w:pPr>
+              <w:spacing w:lineRule="auto"/>
+            </w:pPr>
+            <w:r>
+              <w:rPr/>
+              <w:t xml:space="preserve">Visibilidad</w:t>
+            </w:r>
+          </w:p>
+        </w:tc>
+      </w:tr>
+      <w:tr>
+        <w:trPr/>
+        <w:tc>
+          <w:tcPr>
+            <w:tcBorders>
+              <w:top w:val="single" w:sz="1" w:space="0" w:color="000000"/>
+              <w:bottom w:val="single" w:sz="1" w:space="0" w:color="000000"/>
+              <w:left w:val="single" w:sz="1" w:space="0" w:color="000000"/>
+              <w:right w:val="single" w:sz="1" w:space="0" w:color="000000"/>
+            </w:tcBorders>
+          </w:tcPr>
+          <w:p>
+            <w:pPr>
+              <w:spacing w:lineRule="auto"/>
+            </w:pPr>
+            <w:r>
+              <w:rPr/>
+              <w:t xml:space="preserve">Embarcador</w:t>
+            </w:r>
+          </w:p>
+        </w:tc>
+        <w:tc>
+          <w:tcPr>
+            <w:tcBorders>
+              <w:top w:val="single" w:sz="1" w:space="0" w:color="000000"/>
+              <w:bottom w:val="single" w:sz="1" w:space="0" w:color="000000"/>
+              <w:left w:val="single" w:sz="1" w:space="0" w:color="000000"/>
+              <w:right w:val="single" w:sz="1" w:space="0" w:color="000000"/>
+            </w:tcBorders>
+          </w:tcPr>
+          <w:p>
+            <w:pPr>
+              <w:spacing w:lineRule="auto"/>
+            </w:pPr>
+            <w:r>
+              <w:rPr>
+                <w:b/>
+              </w:rPr>
+              <w:t xml:space="preserve">10%</w:t>
+            </w:r>
+          </w:p>
+          <w:p>
+            <w:pPr>
+              <w:spacing w:lineRule="auto"/>
+            </w:pPr>
+            <w:r>
+              <w:rPr/>
+              <w:t xml:space="preserve"> «Servicio Cubik» sobre </w:t>
+            </w:r>
+          </w:p>
+          <w:p>
+            <w:pPr>
+              <w:spacing w:lineRule="auto"/>
+            </w:pPr>
+            <w:r>
+              <w:rPr>
+                <w:highlight w:val="lightGray"/>
+              </w:rPr>
+              <w:t xml:space="preserve">agreed_price_clp</w:t>
+            </w:r>
+          </w:p>
+        </w:tc>
+        <w:tc>
+          <w:tcPr>
+            <w:tcBorders>
+              <w:top w:val="single" w:sz="1" w:space="0" w:color="000000"/>
+              <w:bottom w:val="single" w:sz="1" w:space="0" w:color="000000"/>
+              <w:left w:val="single" w:sz="1" w:space="0" w:color="000000"/>
+              <w:right w:val="single" w:sz="1" w:space="0" w:color="000000"/>
+            </w:tcBorders>
+          </w:tcPr>
+          <w:p>
+            <w:pPr>
+              <w:spacing w:lineRule="auto"/>
+            </w:pPr>
+            <w:r>
+              <w:rPr/>
+              <w:t xml:space="preserve">Solo ve su 10%; no ve el 5% del transportista</w:t>
+            </w:r>
+          </w:p>
+        </w:tc>
+      </w:tr>
+      <w:tr>
+        <w:trPr/>
+        <w:tc>
+          <w:tcPr>
+            <w:tcBorders>
+              <w:top w:val="single" w:sz="1" w:space="0" w:color="000000"/>
+              <w:bottom w:val="single" w:sz="1" w:space="0" w:color="000000"/>
+              <w:left w:val="single" w:sz="1" w:space="0" w:color="000000"/>
+              <w:right w:val="single" w:sz="1" w:space="0" w:color="000000"/>
+            </w:tcBorders>
+          </w:tcPr>
+          <w:p>
+            <w:pPr>
+              <w:spacing w:lineRule="auto"/>
+            </w:pPr>
+            <w:r>
+              <w:rPr/>
+              <w:t xml:space="preserve">Transportista</w:t>
+            </w:r>
+          </w:p>
+        </w:tc>
+        <w:tc>
+          <w:tcPr>
+            <w:tcBorders>
+              <w:top w:val="single" w:sz="1" w:space="0" w:color="000000"/>
+              <w:bottom w:val="single" w:sz="1" w:space="0" w:color="000000"/>
+              <w:left w:val="single" w:sz="1" w:space="0" w:color="000000"/>
+              <w:right w:val="single" w:sz="1" w:space="0" w:color="000000"/>
+            </w:tcBorders>
+          </w:tcPr>
+          <w:p>
+            <w:pPr>
+              <w:spacing w:lineRule="auto"/>
+            </w:pPr>
+            <w:r>
+              <w:rPr>
+                <w:b/>
+              </w:rPr>
+              <w:t xml:space="preserve">5%</w:t>
+            </w:r>
+          </w:p>
+          <w:p>
+            <w:pPr>
+              <w:spacing w:lineRule="auto"/>
+            </w:pPr>
+            <w:r>
+              <w:rPr/>
+              <w:t xml:space="preserve"> comisión sobre </w:t>
+            </w:r>
+          </w:p>
+          <w:p>
+            <w:pPr>
+              <w:spacing w:lineRule="auto"/>
+            </w:pPr>
+            <w:r>
+              <w:rPr>
+                <w:highlight w:val="lightGray"/>
+              </w:rPr>
+              <w:t xml:space="preserve">agreed_price_clp</w:t>
+            </w:r>
+          </w:p>
+        </w:tc>
+        <w:tc>
+          <w:tcPr>
+            <w:tcBorders>
+              <w:top w:val="single" w:sz="1" w:space="0" w:color="000000"/>
+              <w:bottom w:val="single" w:sz="1" w:space="0" w:color="000000"/>
+              <w:left w:val="single" w:sz="1" w:space="0" w:color="000000"/>
+              <w:right w:val="single" w:sz="1" w:space="0" w:color="000000"/>
+            </w:tcBorders>
+          </w:tcPr>
+          <w:p>
+            <w:pPr>
+              <w:spacing w:lineRule="auto"/>
+            </w:pPr>
+            <w:r>
+              <w:rPr/>
+              <w:t xml:space="preserve">Solo ve su 5%; no ve el 10% del embarcador</w:t>
+            </w:r>
+          </w:p>
+        </w:tc>
+      </w:tr>
+      <w:tr>
+        <w:trPr/>
+        <w:tc>
+          <w:tcPr>
+            <w:tcBorders>
+              <w:top w:val="single" w:sz="1" w:space="0" w:color="000000"/>
+              <w:bottom w:val="single" w:sz="1" w:space="0" w:color="000000"/>
+              <w:left w:val="single" w:sz="1" w:space="0" w:color="000000"/>
+              <w:right w:val="single" w:sz="1" w:space="0" w:color="000000"/>
+            </w:tcBorders>
+          </w:tcPr>
+          <w:p>
+            <w:pPr>
+              <w:spacing w:lineRule="auto"/>
+            </w:pPr>
+            <w:r>
+              <w:rPr/>
+              <w:t xml:space="preserve">Plataforma</w:t>
+            </w:r>
+          </w:p>
+        </w:tc>
+        <w:tc>
+          <w:tcPr>
+            <w:tcBorders>
+              <w:top w:val="single" w:sz="1" w:space="0" w:color="000000"/>
+              <w:bottom w:val="single" w:sz="1" w:space="0" w:color="000000"/>
+              <w:left w:val="single" w:sz="1" w:space="0" w:color="000000"/>
+              <w:right w:val="single" w:sz="1" w:space="0" w:color="000000"/>
+            </w:tcBorders>
+          </w:tcPr>
+          <w:p>
+            <w:pPr>
+              <w:spacing w:lineRule="auto"/>
+            </w:pPr>
+            <w:r>
+              <w:rPr>
+                <w:b/>
+              </w:rPr>
+              <w:t xml:space="preserve">15%</w:t>
+            </w:r>
+          </w:p>
+          <w:p>
+            <w:pPr>
+              <w:spacing w:lineRule="auto"/>
+            </w:pPr>
+            <w:r>
+              <w:rPr/>
+              <w:t xml:space="preserve"> efectivo del GMV flete</w:t>
+            </w:r>
+          </w:p>
+        </w:tc>
+        <w:tc>
+          <w:tcPr>
+            <w:tcBorders>
+              <w:top w:val="single" w:sz="1" w:space="0" w:color="000000"/>
+              <w:bottom w:val="single" w:sz="1" w:space="0" w:color="000000"/>
+              <w:left w:val="single" w:sz="1" w:space="0" w:color="000000"/>
+              <w:right w:val="single" w:sz="1" w:space="0" w:color="000000"/>
+            </w:tcBorders>
+          </w:tcPr>
+          <w:p>
+            <w:pPr>
+              <w:spacing w:lineRule="auto"/>
+            </w:pPr>
+            <w:r>
+              <w:rPr/>
+              <w:t xml:space="preserve">Panel admin</w:t>
+            </w:r>
+          </w:p>
+        </w:tc>
+      </w:tr>
+    </w:tbl>
+    <w:p>
+      <w:pPr>
+        <w:spacing w:lineRule="auto"/>
+      </w:pPr>
+      <w:r>
+        <w:rPr/>
       </w:r>
     </w:p>
     <w:p>
@@ -679,11 +1005,75 @@
         <w:rPr>
           <w:b/>
         </w:rPr>
-        <w:t xml:space="preserve">12–15%</w:t>
-      </w:r>
-      <w:r>
-        <w:rPr/>
-        <w:t xml:space="preserve"> sobre el flete acordado en la app. Ingreso incremental para el transportista; la comisión se justifica por match, estados, chat y reglas de cancelación.</w:t>
+        <w:t xml:space="preserve">Ejemplo</w:t>
+      </w:r>
+      <w:r>
+        <w:rPr/>
+        <w:t xml:space="preserve"> flete $1.200.000: Cubik ingresa $180.000; embarcador paga $1.320.000 al salir en ruta; transportista recibe $1.140.000 al completar.</w:t>
+      </w:r>
+    </w:p>
+    <w:p>
+      <w:pPr>
+        <w:spacing w:lineRule="auto"/>
+      </w:pPr>
+      <w:r>
+        <w:rPr>
+          <w:b/>
+        </w:rPr>
+        <w:t xml:space="preserve">Cobro:</w:t>
+      </w:r>
+      <w:r>
+        <w:rPr>
+          <w:b/>
+        </w:rPr>
+        <w:t xml:space="preserve">Cubik Saldo</w:t>
+      </w:r>
+      <w:r>
+        <w:rPr/>
+        <w:t xml:space="preserve"> (wallet tipo Uber Cash), sin efectivo. Publicar requiere 20% del presupuesto máximo en saldo; retención al </w:t>
+      </w:r>
+      <w:r>
+        <w:rPr>
+          <w:b/>
+        </w:rPr>
+        <w:t xml:space="preserve">Marcar en ruta</w:t>
+      </w:r>
+      <w:r>
+        <w:rPr/>
+        <w:t xml:space="preserve">; liberación al completar. Tier ≥ </w:t>
+      </w:r>
+      <w:r>
+        <w:rPr>
+          <w:b/>
+        </w:rPr>
+        <w:t xml:space="preserve">$1.000.000</w:t>
+      </w:r>
+      <w:r>
+        <w:rPr/>
+        <w:t xml:space="preserve">: factura + saldo/transferencia registrada.</w:t>
+      </w:r>
+    </w:p>
+    <w:p>
+      <w:pPr>
+        <w:spacing w:lineRule="auto"/>
+      </w:pPr>
+      <w:r>
+        <w:rPr>
+          <w:b/>
+        </w:rPr>
+        <w:t xml:space="preserve">Piloto v0.0.100–0.0.105:</w:t>
+      </w:r>
+      <w:r>
+        <w:rPr/>
+        <w:t xml:space="preserve"> comisiones 10/5 simuladas post-</w:t>
+      </w:r>
+      <w:r>
+        <w:rPr/>
+        <w:t xml:space="preserve">completed</w:t>
+      </w:r>
+      <w:r>
+        <w:rPr/>
+        <w:t xml:space="preserve">; sin wallet real aún. GMV piloto = simulación UI.</w:t>
       </w:r>
     </w:p>
     <w:p>
@@ -693,16 +1083,107 @@
       </w:pPr>
       <w:r>
         <w:rPr/>
-        <w:t xml:space="preserve">Fase B — Híbrido SaaS + transaccional</w:t>
-      </w:r>
-    </w:p>
-    <w:p>
-      <w:pPr>
-        <w:spacing w:lineRule="auto"/>
-      </w:pPr>
-      <w:r>
-        <w:rPr/>
-        <w:t xml:space="preserve">Suscripción para embarcadores frecuentes: historial, prioridad de match, reportes.</w:t>
+        <w:t xml:space="preserve">Sugerencia de presupuesto al publicar (v0.0.105)</w:t>
+      </w:r>
+    </w:p>
+    <w:p>
+      <w:pPr>
+        <w:spacing w:lineRule="auto"/>
+      </w:pPr>
+      <w:r>
+        <w:rPr/>
+        <w:t xml:space="preserve">La app propone un rango orientativo al embarcador (</w:t>
+      </w:r>
+      <w:r>
+        <w:rPr/>
+        <w:t xml:space="preserve">POST /api/maps/budget-estimate</w:t>
+      </w:r>
+      <w:r>
+        <w:rPr/>
+        <w:t xml:space="preserve">). Coeficientes calibrados corredor RM–Valparaíso (jun 2026): base </w:t>
+      </w:r>
+      <w:r>
+        <w:rPr>
+          <w:b/>
+        </w:rPr>
+        <w:t xml:space="preserve">$80.000</w:t>
+      </w:r>
+      <w:r>
+        <w:rPr/>
+        <w:t xml:space="preserve">, </w:t>
+      </w:r>
+      <w:r>
+        <w:rPr>
+          <w:b/>
+        </w:rPr>
+        <w:t xml:space="preserve">$450/km</w:t>
+      </w:r>
+      <w:r>
+        <w:rPr/>
+        <w:t xml:space="preserve">, </w:t>
+      </w:r>
+      <w:r>
+        <w:rPr>
+          <w:b/>
+        </w:rPr>
+        <w:t xml:space="preserve">$22/kg</w:t>
+      </w:r>
+      <w:r>
+        <w:rPr/>
+        <w:t xml:space="preserve">, urgente ×1,18; rango publicado 82%–125%. Ejemplo Renca–La Serena (~463 km, 12 t): ~$452k–$691k vs viaje acordado ~$570k. Configurable en Railway (</w:t>
+      </w:r>
+      <w:r>
+        <w:rPr/>
+        <w:t xml:space="preserve">BUDGET_*</w:t>
+      </w:r>
+      <w:r>
+        <w:rPr/>
+        <w:t xml:space="preserve">). No bloquea ofertas fuera de rango.</w:t>
+      </w:r>
+    </w:p>
+    <w:p>
+      <w:pPr>
+        <w:spacing w:lineRule="auto"/>
+      </w:pPr>
+      <w:r>
+        <w:rPr/>
+        <w:t xml:space="preserve">Comparación con costo logístico por kg de informes internos (red masiva, tramos «Recepción»): no es comparable 1:1 con flete spot dedicado; ver canvas </w:t>
+      </w:r>
+      <w:r>
+        <w:rPr/>
+        <w:t xml:space="preserve">comparacion-costos-transporte</w:t>
+      </w:r>
+      <w:r>
+        <w:rPr/>
+        <w:t xml:space="preserve">.</w:t>
+      </w:r>
+    </w:p>
+    <w:p>
+      <w:pPr>
+        <w:spacing w:lineRule="auto"/>
+      </w:pPr>
+      <w:r>
+        <w:rPr/>
+        <w:t xml:space="preserve">Implementación wallet/escrow producción: siguiente etapa. Tarifario por corredor/tipo camión: futuro.</w:t>
+      </w:r>
+    </w:p>
+    <w:p>
+      <w:pPr>
+        <w:pStyle w:val="Heading3"/>
+        <w:spacing w:lineRule="auto"/>
+      </w:pPr>
+      <w:r>
+        <w:rPr/>
+        <w:t xml:space="preserve">Fase B — Cubik Plus Empresa (tipo Uber One)</w:t>
+      </w:r>
+    </w:p>
+    <w:p>
+      <w:pPr>
+        <w:spacing w:lineRule="auto"/>
+      </w:pPr>
+      <w:r>
+        <w:rPr/>
+        <w:t xml:space="preserve">Suscripción mensual para embarcadores de alto volumen → descuento en fee embarcador (ej. 10% → 7%). Banner de ahorro en checkout. Plan transportista opcional post-M2.</w:t>
       </w:r>
     </w:p>
     <w:p>

</xml_diff>